<commit_message>
docs: build Integration Test Document matching FUNTION.docx modules and official Capstone title
</commit_message>
<xml_diff>
--- a/DOCKS/[Test Document] Functional Requirement Testing - Integration.docx
+++ b/DOCKS/[Test Document] Functional Requirement Testing - Integration.docx
@@ -52,12 +52,12 @@
           </w:tcPr>
           <w:p>
             <w:r>
-              <w:t>IdentiTrack Student Violation Tracking &amp; Community Service System</w:t>
+              <w:t>IdentiTrack: AN AI-ASSISTED STUDENT DISCIPLINE OFFENSE MONITORING AND TRACKING SYSTEM WITH DECISION SUPPORT, NFC IDENTIFICATION, AND MOBILE APPLICATION</w:t>
             </w:r>
           </w:p>
           <w:p>
             <w:r>
-              <w:t>IdentiTrack Student Violation Tracking &amp; Community Service System</w:t>
+              <w:t>IdentiTrack: AN AI-ASSISTED STUDENT DISCIPLINE OFFENSE MONITORING AND TRACKING SYSTEM WITH DECISION SUPPORT, NFC IDENTIFICATION, AND MOBILE APPLICATION</w:t>
             </w:r>
           </w:p>
         </w:tc>
@@ -176,7 +176,7 @@
           </w:tcPr>
           <w:p>
             <w:r>
-              <w:t>Security Guard logged into Guard Portal; SDO Admin logged into Admin Portal via 2FA Email OTP; student profile registered.</w:t>
+              <w:t>Security guard opens Guard Portal login page; SDO Admin is authenticated via 2FA (Email OTP); student profile registered.</w:t>
             </w:r>
           </w:p>
         </w:tc>
@@ -268,7 +268,7 @@
           </w:tcPr>
           <w:p>
             <w:r>
-              <w:t>Guard Incident Logging (FR-01), Evidence Attachment (FR-02), Admin Guard Review (FR-03), Guard Account Creation (FR-21)</w:t>
+              <w:t>Campus Guard Incident Reporting (FR-01), Incident Evidence &amp; Photo Attachment (FR-02), SDO Admin Guard Report Review (FR-03), Admin Profile &amp; Campus Security Guard Account Creation (FR-21)</w:t>
             </w:r>
           </w:p>
         </w:tc>
@@ -365,12 +365,12 @@
           </w:tcPr>
           <w:p>
             <w:r>
-              <w:t>IdentiTrack Student Violation Tracking &amp; Community Service System</w:t>
+              <w:t>IdentiTrack: AN AI-ASSISTED STUDENT DISCIPLINE OFFENSE MONITORING AND TRACKING SYSTEM WITH DECISION SUPPORT, NFC IDENTIFICATION, AND MOBILE APPLICATION</w:t>
             </w:r>
           </w:p>
           <w:p>
             <w:r>
-              <w:t>IdentiTrack Student Violation Tracking &amp; Community Service System</w:t>
+              <w:t>IdentiTrack: AN AI-ASSISTED STUDENT DISCIPLINE OFFENSE MONITORING AND TRACKING SYSTEM WITH DECISION SUPPORT, NFC IDENTIFICATION, AND MOBILE APPLICATION</w:t>
             </w:r>
           </w:p>
         </w:tc>
@@ -489,7 +489,7 @@
           </w:tcPr>
           <w:p>
             <w:r>
-              <w:t>Student receiving minor offense is logged; parent/guardian contact details exist in student profile.</w:t>
+              <w:t>Minor offense is logged for a student (with optional photo incident attachment); parent/guardian contact details exist in student profile.</w:t>
             </w:r>
           </w:p>
         </w:tc>
@@ -581,7 +581,7 @@
           </w:tcPr>
           <w:p>
             <w:r>
-              <w:t>Progressive Minor Warnings (FR-04), 3rd Different Minor Warning Modal (FR-05), Student App OTP Authentication (FR-15), Alerts Hub (FR-18)</w:t>
+              <w:t>Progressive Minor Offense Warnings (FR-04), 3rd Different Minor Offense Student App Warning Modal (FR-05), Student App OTP Login Authentication (FR-15), Student App Alerts &amp; Notification Hub (FR-18)</w:t>
             </w:r>
           </w:p>
         </w:tc>
@@ -678,12 +678,12 @@
           </w:tcPr>
           <w:p>
             <w:r>
-              <w:t>IdentiTrack Student Violation Tracking &amp; Community Service System</w:t>
+              <w:t>IdentiTrack: AN AI-ASSISTED STUDENT DISCIPLINE OFFENSE MONITORING AND TRACKING SYSTEM WITH DECISION SUPPORT, NFC IDENTIFICATION, AND MOBILE APPLICATION</w:t>
             </w:r>
           </w:p>
           <w:p>
             <w:r>
-              <w:t>IdentiTrack Student Violation Tracking &amp; Community Service System</w:t>
+              <w:t>IdentiTrack: AN AI-ASSISTED STUDENT DISCIPLINE OFFENSE MONITORING AND TRACKING SYSTEM WITH DECISION SUPPORT, NFC IDENTIFICATION, AND MOBILE APPLICATION</w:t>
             </w:r>
           </w:p>
         </w:tc>
@@ -894,7 +894,7 @@
           </w:tcPr>
           <w:p>
             <w:r>
-              <w:t>Section 4 Escalation Engine (FR-06), Major Category Classification (FR-07), Form F-005 NFE Delivery (FR-08), NFE Student Response (FR-09), Offenses Tab Red Merge (FR-16)</w:t>
+              <w:t>Section 4 Automatic Major Case Escalation (FR-06), Major Offense Category Classification (FR-07), Form F-005 Notice to Explain Delivery (FR-08), Hearing Attendance Confirmation &amp; NFE Submission (FR-09), Student App Offenses Tab &amp; Section 4, Automatic Major (FR-16)</w:t>
             </w:r>
           </w:p>
         </w:tc>
@@ -991,12 +991,12 @@
           </w:tcPr>
           <w:p>
             <w:r>
-              <w:t>IdentiTrack Student Violation Tracking &amp; Community Service System</w:t>
+              <w:t>IdentiTrack: AN AI-ASSISTED STUDENT DISCIPLINE OFFENSE MONITORING AND TRACKING SYSTEM WITH DECISION SUPPORT, NFC IDENTIFICATION, AND MOBILE APPLICATION</w:t>
             </w:r>
           </w:p>
           <w:p>
             <w:r>
-              <w:t>IdentiTrack Student Violation Tracking &amp; Community Service System</w:t>
+              <w:t>IdentiTrack: AN AI-ASSISTED STUDENT DISCIPLINE OFFENSE MONITORING AND TRACKING SYSTEM WITH DECISION SUPPORT, NFC IDENTIFICATION, AND MOBILE APPLICATION</w:t>
             </w:r>
           </w:p>
         </w:tc>
@@ -1087,12 +1087,12 @@
           </w:tcPr>
           <w:p>
             <w:r>
-              <w:t>Web Application (Admin &amp; UPCC Portals) &amp; Python AI Service (softeng_2-master)</w:t>
+              <w:t>Web Application (Admin &amp; UPCC Portals) &amp; Python AI Service (Identitrack Ai)</w:t>
             </w:r>
           </w:p>
           <w:p>
             <w:r>
-              <w:t>Web Application (Admin &amp; UPCC Portals) &amp; Python AI Service (softeng_2-master)</w:t>
+              <w:t>Web Application (Admin &amp; UPCC Portals) &amp; Python AI Service (Identitrack Ai)</w:t>
             </w:r>
           </w:p>
         </w:tc>
@@ -1207,7 +1207,7 @@
           </w:tcPr>
           <w:p>
             <w:r>
-              <w:t>Department Anti-Bias Hearing Scheduler (FR-10), Local XGBoost AI Service (FR-11), 2FA Panel Hearing Room Voting (FR-12)</w:t>
+              <w:t>UPCC Panel Hearing Scheduling &amp; Panel Confirmation (FR-10), Local XGBoost AI Sanction Engine (FR-11), UPCC Panel 2FA Login &amp; Hearing Live Consensus Voting (FR-12)</w:t>
             </w:r>
           </w:p>
         </w:tc>
@@ -1304,12 +1304,12 @@
           </w:tcPr>
           <w:p>
             <w:r>
-              <w:t>IdentiTrack Student Violation Tracking &amp; Community Service System</w:t>
+              <w:t>IdentiTrack: AN AI-ASSISTED STUDENT DISCIPLINE OFFENSE MONITORING AND TRACKING SYSTEM WITH DECISION SUPPORT, NFC IDENTIFICATION, AND MOBILE APPLICATION</w:t>
             </w:r>
           </w:p>
           <w:p>
             <w:r>
-              <w:t>IdentiTrack Student Violation Tracking &amp; Community Service System</w:t>
+              <w:t>IdentiTrack: AN AI-ASSISTED STUDENT DISCIPLINE OFFENSE MONITORING AND TRACKING SYSTEM WITH DECISION SUPPORT, NFC IDENTIFICATION, AND MOBILE APPLICATION</w:t>
             </w:r>
           </w:p>
         </w:tc>
@@ -1520,7 +1520,7 @@
           </w:tcPr>
           <w:p>
             <w:r>
-              <w:t>Admin NFI Issuance (FR-13), Student ACCEPT/APPEAL Decision (FR-14), Admin Sanction Hours Adjustment (FR-20), Multi-Category Account Freezing (FR-22)</w:t>
+              <w:t>Admin Decision Finalization &amp; NFI Issuance (FR-13), Student Decision Response (Accept or Appeal) (FR-14), Admin Sanctions Management &amp; Appeal Hours Adjustment (FR-20), Multi-Category Sanction Enforcement &amp; Account Freezing (FR-22)</w:t>
             </w:r>
           </w:p>
         </w:tc>
@@ -1617,12 +1617,12 @@
           </w:tcPr>
           <w:p>
             <w:r>
-              <w:t>IdentiTrack Student Violation Tracking &amp; Community Service System</w:t>
+              <w:t>IdentiTrack: AN AI-ASSISTED STUDENT DISCIPLINE OFFENSE MONITORING AND TRACKING SYSTEM WITH DECISION SUPPORT, NFC IDENTIFICATION, AND MOBILE APPLICATION</w:t>
             </w:r>
           </w:p>
           <w:p>
             <w:r>
-              <w:t>IdentiTrack Student Violation Tracking &amp; Community Service System</w:t>
+              <w:t>IdentiTrack: AN AI-ASSISTED STUDENT DISCIPLINE OFFENSE MONITORING AND TRACKING SYSTEM WITH DECISION SUPPORT, NFC IDENTIFICATION, AND MOBILE APPLICATION</w:t>
             </w:r>
           </w:p>
         </w:tc>
@@ -1833,7 +1833,7 @@
           </w:tcPr>
           <w:p>
             <w:r>
-              <w:t>Community Service Tab &amp; Dashboard Display (FR-17), Manual Entry &amp; Auto-Pause Logout (FR-18), Service Completion &amp; Excel Privacy Masking (FR-19)</w:t>
+              <w:t>Service Tab Unlock, Dashboard Display &amp; Web Session Login (FR-17), Manual Entry Approval, Task Assignment &amp; Supervisor Logout Pause (FR-18), Service Completion Alerts, Audit Trail &amp; Reports Privacy Masking (FR-19)</w:t>
             </w:r>
           </w:p>
         </w:tc>

</xml_diff>